<commit_message>
V5 Mental Accounting: add EL MOVIMIENTO section (6 beats)
Inserts actionable financial closing before THE ENDING — bonus redirect
rule, pension match reframe, pre-commitment rule card, and pain-of-paying
deliberate use. Rebuilds all 5 output files (121 beats, 1649 words).

https://claude.ai/code/session_01L4D3BJE5wxKGrRneu3Lana
</commit_message>
<xml_diff>
--- a/Mental_Accounting_Production.docx
+++ b/Mental_Accounting_Production.docx
@@ -15037,7 +15037,7 @@
                 <w:b/>
                 <w:sz w:val="18"/>
               </w:rPr>
-              <w:t>You cannot stop your brain from keeping mental accounts.</w:t>
+              <w:t>Here is what you do with this.</w:t>
             </w:r>
           </w:p>
         </w:tc>
@@ -15054,7 +15054,7 @@
                 <w:b w:val="0"/>
                 <w:sz w:val="16"/>
               </w:rPr>
-              <w:t>Medium shot of the main character. The brain inside the skull is filing automatically — EARNED here, WINDFALL there — the folders moving on their own without the character's input. Automatic. Below conscious control. The character can't see it.</w:t>
+              <w:t>Medium shot. The main character turns directly to camera, relaxed and prepared. The brain inside the skull shifts from its smug expression to a focused, practical one. A single bold label appears beside the character: 'THE MOVE.' Clean white background.</w:t>
             </w:r>
           </w:p>
         </w:tc>
@@ -15071,7 +15071,7 @@
                 <w:b w:val="0"/>
                 <w:sz w:val="16"/>
               </w:rPr>
-              <w:t>Medium shot</w:t>
+              <w:t>Medium shot, direct address</w:t>
             </w:r>
           </w:p>
         </w:tc>
@@ -15088,7 +15088,7 @@
                 <w:b w:val="0"/>
                 <w:sz w:val="16"/>
               </w:rPr>
-              <w:t>Flat, white</w:t>
+              <w:t>Flat, white, single spotlight</w:t>
             </w:r>
           </w:p>
         </w:tc>
@@ -15105,7 +15105,7 @@
                 <w:b w:val="0"/>
                 <w:sz w:val="16"/>
               </w:rPr>
-              <w:t>The honest limit — but not hopeless</w:t>
+              <w:t>The transition into action — viewer attention sharpens</w:t>
             </w:r>
           </w:p>
         </w:tc>
@@ -15122,7 +15122,7 @@
                 <w:b w:val="0"/>
                 <w:sz w:val="16"/>
               </w:rPr>
-              <w:t>Brain filing automatically below character's awareness; automatic filing visible</w:t>
+              <w:t>Character turns to camera; brain shifts to practical expression; 'THE MOVE' label</w:t>
             </w:r>
           </w:p>
         </w:tc>
@@ -15139,7 +15139,7 @@
                 <w:b w:val="0"/>
                 <w:sz w:val="16"/>
               </w:rPr>
-              <w:t>Static. Folders move on their own; character is unaware of the filing. 2s.</w:t>
+              <w:t>Static. Character holds direct address; brain expression shifts. 2s.</w:t>
             </w:r>
           </w:p>
         </w:tc>
@@ -15176,7 +15176,7 @@
                 <w:b/>
                 <w:sz w:val="18"/>
               </w:rPr>
-              <w:t>The system runs below the threshold of conscious thought. It was there before you knew the word for it.</w:t>
+              <w:t>The next time a bonus arrives — before you spend a single euro — set up an automatic transfer to your investment account or emergency fund for that same day.</w:t>
             </w:r>
           </w:p>
         </w:tc>
@@ -15193,7 +15193,7 @@
                 <w:b w:val="0"/>
                 <w:sz w:val="16"/>
               </w:rPr>
-              <w:t>Wide diagram. A horizontal consciousness line across the center. Above: the character's deliberate thoughts. Below: the mental accounting system running quietly — folders, signals, triggers — all active and invisible. Label: 'BELOW CONSCIOUS THRESHOLD.'</w:t>
+              <w:t>Wide shot. A bonus envelope arrives and lands in the character's hands. Before the WINDFALL folder opens, a bold arrow redirects the money straight to two small icons: a bar chart (INVESTMENT) and a safety shield (EMERGENCY FUND). The redirection happens before the brain can file it as free. Label: 'REDIRECT FIRST.'</w:t>
             </w:r>
           </w:p>
         </w:tc>
@@ -15210,7 +15210,7 @@
                 <w:b w:val="0"/>
                 <w:sz w:val="16"/>
               </w:rPr>
-              <w:t>Wide diagram shot</w:t>
+              <w:t>Wide shot</w:t>
             </w:r>
           </w:p>
         </w:tc>
@@ -15227,7 +15227,7 @@
                 <w:b w:val="0"/>
                 <w:sz w:val="16"/>
               </w:rPr>
-              <w:t>Flat, white</w:t>
+              <w:t>Flat, white, transfer arrow highlighted green</w:t>
             </w:r>
           </w:p>
         </w:tc>
@@ -15244,7 +15244,7 @@
                 <w:b w:val="0"/>
                 <w:sz w:val="16"/>
               </w:rPr>
-              <w:t>The depth of the system — below reach but not invisible</w:t>
+              <w:t>Action clarity — the rule is concrete and executable</w:t>
             </w:r>
           </w:p>
         </w:tc>
@@ -15261,7 +15261,7 @@
                 <w:b w:val="0"/>
                 <w:sz w:val="16"/>
               </w:rPr>
-              <w:t>Consciousness threshold line; mental accounting active below; label</w:t>
+              <w:t>Bonus arriving; redirect arrow to investment + emergency fund before brain files it</w:t>
             </w:r>
           </w:p>
         </w:tc>
@@ -15278,7 +15278,7 @@
                 <w:b w:val="0"/>
                 <w:sz w:val="16"/>
               </w:rPr>
-              <w:t>Static. System below line is detailed and active; above line is calm. 3s.</w:t>
+              <w:t>Animated. Arrow diverts bonus before WINDFALL folder opens; green glow on arrival. 3s.</w:t>
             </w:r>
           </w:p>
         </w:tc>
@@ -15315,7 +15315,7 @@
                 <w:b/>
                 <w:sz w:val="18"/>
               </w:rPr>
-              <w:t>But you can learn to read the filing.</w:t>
+              <w:t>Not because you need discipline. Because your brain is about to file it as free money. You are faster than the filing.</w:t>
             </w:r>
           </w:p>
         </w:tc>
@@ -15332,7 +15332,7 @@
                 <w:b w:val="0"/>
                 <w:sz w:val="16"/>
               </w:rPr>
-              <w:t>Wide shot. The character now has a window into the filing system — a small transparent panel in their own chest through which the EARNED / WINDFALL folders are visible. The character examines it calmly. A magnifying glass in hand.</w:t>
+              <w:t>Medium shot. The WINDFALL folder begins to open automatically — but the character's hand reaches the transfer lever first, moving it. The brain watches, slightly outpaced. Expression on the brain: surprised, not defeated. A small race graphic: character vs brain, character wins by a step. Label: 'YOU ARE FASTER.'</w:t>
             </w:r>
           </w:p>
         </w:tc>
@@ -15349,7 +15349,7 @@
                 <w:b w:val="0"/>
                 <w:sz w:val="16"/>
               </w:rPr>
-              <w:t>Wide shot</w:t>
+              <w:t>Medium shot</w:t>
             </w:r>
           </w:p>
         </w:tc>
@@ -15366,7 +15366,7 @@
                 <w:b w:val="0"/>
                 <w:sz w:val="16"/>
               </w:rPr>
-              <w:t>Flat, white, soft chest panel glow</w:t>
+              <w:t>Flat, white</w:t>
             </w:r>
           </w:p>
         </w:tc>
@@ -15383,7 +15383,7 @@
                 <w:b w:val="0"/>
                 <w:sz w:val="16"/>
               </w:rPr>
-              <w:t>The capability — seeing is the first step</w:t>
+              <w:t>Reframe — speed not willpower</w:t>
             </w:r>
           </w:p>
         </w:tc>
@@ -15400,7 +15400,7 @@
                 <w:b w:val="0"/>
                 <w:sz w:val="16"/>
               </w:rPr>
-              <w:t>Character with transparent chest panel showing filing system; magnifying glass</w:t>
+              <w:t>Character beats brain to the transfer lever; brain surprised; race graphic</w:t>
             </w:r>
           </w:p>
         </w:tc>
@@ -15417,7 +15417,7 @@
                 <w:b w:val="0"/>
                 <w:sz w:val="16"/>
               </w:rPr>
-              <w:t>Static. Chest panel glows softly; magnifying glass positioned. 2s.</w:t>
+              <w:t>Animated. Character moves lever a beat before folder opens; race graphic brief flash. 3s.</w:t>
             </w:r>
           </w:p>
         </w:tc>
@@ -15454,7 +15454,7 @@
                 <w:b/>
                 <w:sz w:val="18"/>
               </w:rPr>
-              <w:t>When money arrives — any money — ask one question before you do anything with it.</w:t>
+              <w:t>If your employer offers a pension match and you are not maximizing it — that is not a benefit you are leaving on the table. That is your own compensation that your brain has quietly filed as optional.</w:t>
             </w:r>
           </w:p>
         </w:tc>
@@ -15471,7 +15471,7 @@
                 <w:b w:val="0"/>
                 <w:sz w:val="16"/>
               </w:rPr>
-              <w:t>Wide shot. Money arrives from above — any kind, all types. The character catches it. Before filing, before spending, before anything — a single bold pause symbol appears. A question mark floats above. The pause is the practice.</w:t>
+              <w:t>Wide shot. A split diagram: left side shows a matched pension contribution as a bonus envelope with a green checkmark — labeled 'YOUR COMPENSATION.' Right side shows the same envelope grayed out, filed into a folder labeled 'OPTIONAL' by the brain in the background. Bold red X on the optional filing. Label: 'IT WAS NEVER OPTIONAL.'</w:t>
             </w:r>
           </w:p>
         </w:tc>
@@ -15488,7 +15488,7 @@
                 <w:b w:val="0"/>
                 <w:sz w:val="16"/>
               </w:rPr>
-              <w:t>Wide shot</w:t>
+              <w:t>Wide diagram</w:t>
             </w:r>
           </w:p>
         </w:tc>
@@ -15505,7 +15505,7 @@
                 <w:b w:val="0"/>
                 <w:sz w:val="16"/>
               </w:rPr>
-              <w:t>Flat, white</w:t>
+              <w:t>Flat, white, red X on optional label</w:t>
             </w:r>
           </w:p>
         </w:tc>
@@ -15522,7 +15522,7 @@
                 <w:b w:val="0"/>
                 <w:sz w:val="16"/>
               </w:rPr>
-              <w:t>The habit introduced — the pause before the filing</w:t>
+              <w:t>The reframe — pension match is earned compensation not a benefit</w:t>
             </w:r>
           </w:p>
         </w:tc>
@@ -15539,7 +15539,7 @@
                 <w:b w:val="0"/>
                 <w:sz w:val="16"/>
               </w:rPr>
-              <w:t>Money arriving; character catching; pause symbol appearing; question mark above</w:t>
+              <w:t>Pension match shown as compensation; brain quietly filing it as optional; red X on that filing</w:t>
             </w:r>
           </w:p>
         </w:tc>
@@ -15556,7 +15556,7 @@
                 <w:b w:val="0"/>
                 <w:sz w:val="16"/>
               </w:rPr>
-              <w:t>Static. Pause symbol appears before any action is taken. 2s.</w:t>
+              <w:t>Static. Diagram holds; red X appears on the optional folder. 3s.</w:t>
             </w:r>
           </w:p>
         </w:tc>
@@ -15593,7 +15593,7 @@
                 <w:b/>
                 <w:sz w:val="18"/>
               </w:rPr>
-              <w:t>Which account is my brain putting this in?</w:t>
+              <w:t>Decide now — before the next windfall arrives — what percentage goes to savings or investment. When the money comes, the rule runs. The brain villain never gets to open the folder.</w:t>
             </w:r>
           </w:p>
         </w:tc>
@@ -15610,7 +15610,7 @@
                 <w:b w:val="0"/>
                 <w:sz w:val="16"/>
               </w:rPr>
-              <w:t>Close-up. The mental account filing cabinet with its two folders — EARNED (blue) and WINDFALL (gold). One folder begins to open automatically. The question mark floats above: which one? The character's hand hovers, choosing to observe rather than react.</w:t>
+              <w:t>Wide shot. A simple rule card floats in front of the character: '___% TO SAVINGS / INVESTMENT.' The character writes in a number. In the background, the brain villain reaches for the WINDFALL folder — but the rule card is already in place, blocking the folder. The brain can't open it. Expression: foiled. Label: 'THE RULE RUNS.'</w:t>
             </w:r>
           </w:p>
         </w:tc>
@@ -15627,7 +15627,7 @@
                 <w:b w:val="0"/>
                 <w:sz w:val="16"/>
               </w:rPr>
-              <w:t>Close-up</w:t>
+              <w:t>Wide shot</w:t>
             </w:r>
           </w:p>
         </w:tc>
@@ -15644,7 +15644,7 @@
                 <w:b w:val="0"/>
                 <w:sz w:val="16"/>
               </w:rPr>
-              <w:t>Flat, white, folders visible</w:t>
+              <w:t>Flat, white, rule card highlighted</w:t>
             </w:r>
           </w:p>
         </w:tc>
@@ -15661,7 +15661,7 @@
                 <w:b w:val="0"/>
                 <w:sz w:val="16"/>
               </w:rPr>
-              <w:t>The question — the entire practice in one line</w:t>
+              <w:t>Pre-commitment — the brain is outmaneuvered before it acts</w:t>
             </w:r>
           </w:p>
         </w:tc>
@@ -15678,7 +15678,7 @@
                 <w:b w:val="0"/>
                 <w:sz w:val="16"/>
               </w:rPr>
-              <w:t>Filing cabinet with two folders; one opening automatically; character observing</w:t>
+              <w:t>Character filling rule card; brain villain blocked from WINDFALL folder; foiled expression</w:t>
             </w:r>
           </w:p>
         </w:tc>
@@ -15695,7 +15695,7 @@
                 <w:b w:val="0"/>
                 <w:sz w:val="16"/>
               </w:rPr>
-              <w:t>Static. Cabinet holds; automatic filing paused by the question. 2s.</w:t>
+              <w:t>Static. Rule card placed; brain villain blocked; folder stays shut. 3s.</w:t>
             </w:r>
           </w:p>
         </w:tc>
@@ -15732,7 +15732,7 @@
                 <w:b/>
                 <w:sz w:val="18"/>
               </w:rPr>
-              <w:t>And is that the account I would choose if I were choosing deliberately?</w:t>
+              <w:t>And use the pain of paying deliberately. Automate your savings transfer on the same day you get paid, before the rest moves. When the transfer hurts slightly, the account is real. When it feels like nothing, it does not exist yet.</w:t>
             </w:r>
           </w:p>
         </w:tc>
@@ -15749,7 +15749,7 @@
                 <w:b w:val="0"/>
                 <w:sz w:val="16"/>
               </w:rPr>
-              <w:t>Close-up. The same filing cabinet — but now a second, deliberate hand appears beside the automatic one. The deliberate hand points to a different folder. The two hands are visible together: automatic vs chosen. The choice belongs to the character.</w:t>
+              <w:t>Wide split diagram. Left: a savings transfer set to auto on payday — a slight grimace on the character, a small ache icon above. Label: 'THE ACCOUNT IS REAL.' Right: the same money sitting untouched, no transfer, character smiling obliviously — and a ghost outline where savings should be. Label: 'IT DOES NOT EXIST YET.' The slight pain is the signal, not the problem.</w:t>
             </w:r>
           </w:p>
         </w:tc>
@@ -15766,7 +15766,7 @@
                 <w:b w:val="0"/>
                 <w:sz w:val="16"/>
               </w:rPr>
-              <w:t>Close-up</w:t>
+              <w:t>Wide split diagram</w:t>
             </w:r>
           </w:p>
         </w:tc>
@@ -15783,7 +15783,7 @@
                 <w:b w:val="0"/>
                 <w:sz w:val="16"/>
               </w:rPr>
-              <w:t>Flat, white</w:t>
+              <w:t>Flat, white, slight ache icon on left, ghost on right</w:t>
             </w:r>
           </w:p>
         </w:tc>
@@ -15800,7 +15800,7 @@
                 <w:b w:val="0"/>
                 <w:sz w:val="16"/>
               </w:rPr>
-              <w:t>The second question — autonomy reclaimed</w:t>
+              <w:t>The counterintuitive close — slight pain means it's working</w:t>
             </w:r>
           </w:p>
         </w:tc>
@@ -15817,7 +15817,7 @@
                 <w:b w:val="0"/>
                 <w:sz w:val="16"/>
               </w:rPr>
-              <w:t>Automatic hand vs deliberate hand at filing cabinet; two choices visible</w:t>
+              <w:t>Pain icon on savings transfer vs ghost savings without transfer; two states compared</w:t>
             </w:r>
           </w:p>
         </w:tc>
@@ -15834,7 +15834,7 @@
                 <w:b w:val="0"/>
                 <w:sz w:val="16"/>
               </w:rPr>
-              <w:t>Static. Both hands visible; deliberate hand points to considered choice. 3s.</w:t>
+              <w:t>Static. Split diagram holds; left ache icon and right ghost outline are the point. 3s.</w:t>
             </w:r>
           </w:p>
         </w:tc>
@@ -15856,7 +15856,7 @@
                 <w:color w:val="FFFFFF"/>
                 <w:sz w:val="18"/>
               </w:rPr>
-              <w:t>── THE ENDING ──</w:t>
+              <w:t>── EL MOVIMIENTO ──</w:t>
             </w:r>
           </w:p>
         </w:tc>
@@ -15893,7 +15893,7 @@
                 <w:b/>
                 <w:sz w:val="18"/>
               </w:rPr>
-              <w:t>The bonus, the win, the gift, the refund — your brain has already filed them somewhere.</w:t>
+              <w:t>You cannot stop your brain from keeping mental accounts.</w:t>
             </w:r>
           </w:p>
         </w:tc>
@@ -15910,7 +15910,7 @@
                 <w:b w:val="0"/>
                 <w:sz w:val="16"/>
               </w:rPr>
-              <w:t>Wide shot. Four money types arrive and are instantly auto-filed by the brain — bonus to WINDFALL, win to WINDFALL, gift to WINDFALL, refund to WINDFALL. All four go to the same folder automatically, instantly, before any conscious thought.</w:t>
+              <w:t>Medium shot of the main character. The brain inside the skull is filing automatically — EARNED here, WINDFALL there — the folders moving on their own without the character's input. Automatic. Below conscious control. The character can't see it.</w:t>
             </w:r>
           </w:p>
         </w:tc>
@@ -15927,7 +15927,7 @@
                 <w:b w:val="0"/>
                 <w:sz w:val="16"/>
               </w:rPr>
-              <w:t>Wide shot</w:t>
+              <w:t>Medium shot</w:t>
             </w:r>
           </w:p>
         </w:tc>
@@ -15961,7 +15961,7 @@
                 <w:b w:val="0"/>
                 <w:sz w:val="16"/>
               </w:rPr>
-              <w:t>The automatic system — the default is already running</w:t>
+              <w:t>The honest limit — but not hopeless</w:t>
             </w:r>
           </w:p>
         </w:tc>
@@ -15978,7 +15978,7 @@
                 <w:b w:val="0"/>
                 <w:sz w:val="16"/>
               </w:rPr>
-              <w:t>Four money types auto-filed to WINDFALL instantly; no conscious input</w:t>
+              <w:t>Brain filing automatically below character's awareness; automatic filing visible</w:t>
             </w:r>
           </w:p>
         </w:tc>
@@ -15995,7 +15995,7 @@
                 <w:b w:val="0"/>
                 <w:sz w:val="16"/>
               </w:rPr>
-              <w:t>Static. All four file to WINDFALL simultaneously; speed is the point. 2s.</w:t>
+              <w:t>Static. Folders move on their own; character is unaware of the filing. 2s.</w:t>
             </w:r>
           </w:p>
         </w:tc>
@@ -16032,7 +16032,7 @@
                 <w:b/>
                 <w:sz w:val="18"/>
               </w:rPr>
-              <w:t>The only question is whether you agree with the filing.</w:t>
+              <w:t>The system runs below the threshold of conscious thought. It was there before you knew the word for it.</w:t>
             </w:r>
           </w:p>
         </w:tc>
@@ -16049,7 +16049,7 @@
                 <w:b w:val="0"/>
                 <w:sz w:val="16"/>
               </w:rPr>
-              <w:t>Wide shot. The same four money types — but now the character stands at the cabinet, reviewing each filing with a pen. Some stay in WINDFALL. Some get moved to EARNED. The character makes deliberate choices, one by one. Expression: calm and capable.</w:t>
+              <w:t>Wide diagram. A horizontal consciousness line across the center. Above: the character's deliberate thoughts. Below: the mental accounting system running quietly — folders, signals, triggers — all active and invisible. Label: 'BELOW CONSCIOUS THRESHOLD.'</w:t>
             </w:r>
           </w:p>
         </w:tc>
@@ -16066,7 +16066,7 @@
                 <w:b w:val="0"/>
                 <w:sz w:val="16"/>
               </w:rPr>
-              <w:t>Wide shot</w:t>
+              <w:t>Wide diagram shot</w:t>
             </w:r>
           </w:p>
         </w:tc>
@@ -16100,7 +16100,7 @@
                 <w:b w:val="0"/>
                 <w:sz w:val="16"/>
               </w:rPr>
-              <w:t>The agency — the audit is possible and practical</w:t>
+              <w:t>The depth of the system — below reach but not invisible</w:t>
             </w:r>
           </w:p>
         </w:tc>
@@ -16117,7 +16117,7 @@
                 <w:b w:val="0"/>
                 <w:sz w:val="16"/>
               </w:rPr>
-              <w:t>Character reviewing and adjusting auto-filings deliberately; pen in hand</w:t>
+              <w:t>Consciousness threshold line; mental accounting active below; label</w:t>
             </w:r>
           </w:p>
         </w:tc>
@@ -16134,7 +16134,7 @@
                 <w:b w:val="0"/>
                 <w:sz w:val="16"/>
               </w:rPr>
-              <w:t>Static. Character moves items with deliberate intention; expression is composed. 3s.</w:t>
+              <w:t>Static. System below line is detailed and active; above line is calm. 3s.</w:t>
             </w:r>
           </w:p>
         </w:tc>
@@ -16171,7 +16171,7 @@
                 <w:b/>
                 <w:sz w:val="18"/>
               </w:rPr>
-              <w:t>Every video on this channel is one way your financial gut has been hacked.</w:t>
+              <w:t>But you can learn to read the filing.</w:t>
             </w:r>
           </w:p>
         </w:tc>
@@ -16188,7 +16188,7 @@
                 <w:b w:val="0"/>
                 <w:sz w:val="16"/>
               </w:rPr>
-              <w:t>Wide shot, white background. The main character faces camera — the brain inside the skull now with its composed, watchful expression (not smug). A row of small icons stretches behind the character: dopamine, bandwidth, somatic markers, mental accounts — each labeled. The channel's mission is visible.</w:t>
+              <w:t>Wide shot. The character now has a window into the filing system — a small transparent panel in their own chest through which the EARNED / WINDFALL folders are visible. The character examines it calmly. A magnifying glass in hand.</w:t>
             </w:r>
           </w:p>
         </w:tc>
@@ -16205,7 +16205,7 @@
                 <w:b w:val="0"/>
                 <w:sz w:val="16"/>
               </w:rPr>
-              <w:t>Wide shot, direct address</w:t>
+              <w:t>Wide shot</w:t>
             </w:r>
           </w:p>
         </w:tc>
@@ -16222,7 +16222,7 @@
                 <w:b w:val="0"/>
                 <w:sz w:val="16"/>
               </w:rPr>
-              <w:t>Flat, white</w:t>
+              <w:t>Flat, white, soft chest panel glow</w:t>
             </w:r>
           </w:p>
         </w:tc>
@@ -16239,7 +16239,7 @@
                 <w:b w:val="0"/>
                 <w:sz w:val="16"/>
               </w:rPr>
-              <w:t>Channel mission — the promise to the viewer</w:t>
+              <w:t>The capability — seeing is the first step</w:t>
             </w:r>
           </w:p>
         </w:tc>
@@ -16256,7 +16256,7 @@
                 <w:b w:val="0"/>
                 <w:sz w:val="16"/>
               </w:rPr>
-              <w:t>Character facing camera; row of channel topic icons behind; brain watchful</w:t>
+              <w:t>Character with transparent chest panel showing filing system; magnifying glass</w:t>
             </w:r>
           </w:p>
         </w:tc>
@@ -16273,7 +16273,7 @@
                 <w:b w:val="0"/>
                 <w:sz w:val="16"/>
               </w:rPr>
-              <w:t>Static. Topic icons glow softly; character holds direct address. 3s.</w:t>
+              <w:t>Static. Chest panel glows softly; magnifying glass positioned. 2s.</w:t>
             </w:r>
           </w:p>
         </w:tc>
@@ -16294,6 +16294,862 @@
                 <w:sz w:val="18"/>
               </w:rPr>
               <w:t>115</w:t>
+            </w:r>
+          </w:p>
+        </w:tc>
+        <w:tc>
+          <w:tcPr>
+            <w:tcW w:type="dxa" w:w="2448"/>
+          </w:tcPr>
+          <w:p>
+            <w:pPr>
+              <w:jc w:val="left"/>
+            </w:pPr>
+            <w:r>
+              <w:rPr>
+                <w:b/>
+                <w:sz w:val="18"/>
+              </w:rPr>
+              <w:t>When money arrives — any money — ask one question before you do anything with it.</w:t>
+            </w:r>
+          </w:p>
+        </w:tc>
+        <w:tc>
+          <w:tcPr>
+            <w:tcW w:type="dxa" w:w="3600"/>
+          </w:tcPr>
+          <w:p>
+            <w:pPr>
+              <w:jc w:val="left"/>
+            </w:pPr>
+            <w:r>
+              <w:rPr>
+                <w:b w:val="0"/>
+                <w:sz w:val="16"/>
+              </w:rPr>
+              <w:t>Wide shot. Money arrives from above — any kind, all types. The character catches it. Before filing, before spending, before anything — a single bold pause symbol appears. A question mark floats above. The pause is the practice.</w:t>
+            </w:r>
+          </w:p>
+        </w:tc>
+        <w:tc>
+          <w:tcPr>
+            <w:tcW w:type="dxa" w:w="1296"/>
+          </w:tcPr>
+          <w:p>
+            <w:pPr>
+              <w:jc w:val="left"/>
+            </w:pPr>
+            <w:r>
+              <w:rPr>
+                <w:b w:val="0"/>
+                <w:sz w:val="16"/>
+              </w:rPr>
+              <w:t>Wide shot</w:t>
+            </w:r>
+          </w:p>
+        </w:tc>
+        <w:tc>
+          <w:tcPr>
+            <w:tcW w:type="dxa" w:w="1152"/>
+          </w:tcPr>
+          <w:p>
+            <w:pPr>
+              <w:jc w:val="left"/>
+            </w:pPr>
+            <w:r>
+              <w:rPr>
+                <w:b w:val="0"/>
+                <w:sz w:val="16"/>
+              </w:rPr>
+              <w:t>Flat, white</w:t>
+            </w:r>
+          </w:p>
+        </w:tc>
+        <w:tc>
+          <w:tcPr>
+            <w:tcW w:type="dxa" w:w="1440"/>
+          </w:tcPr>
+          <w:p>
+            <w:pPr>
+              <w:jc w:val="left"/>
+            </w:pPr>
+            <w:r>
+              <w:rPr>
+                <w:b w:val="0"/>
+                <w:sz w:val="16"/>
+              </w:rPr>
+              <w:t>The habit introduced — the pause before the filing</w:t>
+            </w:r>
+          </w:p>
+        </w:tc>
+        <w:tc>
+          <w:tcPr>
+            <w:tcW w:type="dxa" w:w="1440"/>
+          </w:tcPr>
+          <w:p>
+            <w:pPr>
+              <w:jc w:val="left"/>
+            </w:pPr>
+            <w:r>
+              <w:rPr>
+                <w:b w:val="0"/>
+                <w:sz w:val="16"/>
+              </w:rPr>
+              <w:t>Money arriving; character catching; pause symbol appearing; question mark above</w:t>
+            </w:r>
+          </w:p>
+        </w:tc>
+        <w:tc>
+          <w:tcPr>
+            <w:tcW w:type="dxa" w:w="1800"/>
+          </w:tcPr>
+          <w:p>
+            <w:pPr>
+              <w:jc w:val="left"/>
+            </w:pPr>
+            <w:r>
+              <w:rPr>
+                <w:b w:val="0"/>
+                <w:sz w:val="16"/>
+              </w:rPr>
+              <w:t>Static. Pause symbol appears before any action is taken. 2s.</w:t>
+            </w:r>
+          </w:p>
+        </w:tc>
+      </w:tr>
+      <w:tr>
+        <w:tc>
+          <w:tcPr>
+            <w:tcW w:type="dxa" w:w="504"/>
+          </w:tcPr>
+          <w:p>
+            <w:pPr>
+              <w:jc w:val="left"/>
+            </w:pPr>
+            <w:r>
+              <w:rPr>
+                <w:b/>
+                <w:color w:val="999999"/>
+                <w:sz w:val="18"/>
+              </w:rPr>
+              <w:t>116</w:t>
+            </w:r>
+          </w:p>
+        </w:tc>
+        <w:tc>
+          <w:tcPr>
+            <w:tcW w:type="dxa" w:w="2448"/>
+          </w:tcPr>
+          <w:p>
+            <w:pPr>
+              <w:jc w:val="left"/>
+            </w:pPr>
+            <w:r>
+              <w:rPr>
+                <w:b/>
+                <w:sz w:val="18"/>
+              </w:rPr>
+              <w:t>Which account is my brain putting this in?</w:t>
+            </w:r>
+          </w:p>
+        </w:tc>
+        <w:tc>
+          <w:tcPr>
+            <w:tcW w:type="dxa" w:w="3600"/>
+          </w:tcPr>
+          <w:p>
+            <w:pPr>
+              <w:jc w:val="left"/>
+            </w:pPr>
+            <w:r>
+              <w:rPr>
+                <w:b w:val="0"/>
+                <w:sz w:val="16"/>
+              </w:rPr>
+              <w:t>Close-up. The mental account filing cabinet with its two folders — EARNED (blue) and WINDFALL (gold). One folder begins to open automatically. The question mark floats above: which one? The character's hand hovers, choosing to observe rather than react.</w:t>
+            </w:r>
+          </w:p>
+        </w:tc>
+        <w:tc>
+          <w:tcPr>
+            <w:tcW w:type="dxa" w:w="1296"/>
+          </w:tcPr>
+          <w:p>
+            <w:pPr>
+              <w:jc w:val="left"/>
+            </w:pPr>
+            <w:r>
+              <w:rPr>
+                <w:b w:val="0"/>
+                <w:sz w:val="16"/>
+              </w:rPr>
+              <w:t>Close-up</w:t>
+            </w:r>
+          </w:p>
+        </w:tc>
+        <w:tc>
+          <w:tcPr>
+            <w:tcW w:type="dxa" w:w="1152"/>
+          </w:tcPr>
+          <w:p>
+            <w:pPr>
+              <w:jc w:val="left"/>
+            </w:pPr>
+            <w:r>
+              <w:rPr>
+                <w:b w:val="0"/>
+                <w:sz w:val="16"/>
+              </w:rPr>
+              <w:t>Flat, white, folders visible</w:t>
+            </w:r>
+          </w:p>
+        </w:tc>
+        <w:tc>
+          <w:tcPr>
+            <w:tcW w:type="dxa" w:w="1440"/>
+          </w:tcPr>
+          <w:p>
+            <w:pPr>
+              <w:jc w:val="left"/>
+            </w:pPr>
+            <w:r>
+              <w:rPr>
+                <w:b w:val="0"/>
+                <w:sz w:val="16"/>
+              </w:rPr>
+              <w:t>The question — the entire practice in one line</w:t>
+            </w:r>
+          </w:p>
+        </w:tc>
+        <w:tc>
+          <w:tcPr>
+            <w:tcW w:type="dxa" w:w="1440"/>
+          </w:tcPr>
+          <w:p>
+            <w:pPr>
+              <w:jc w:val="left"/>
+            </w:pPr>
+            <w:r>
+              <w:rPr>
+                <w:b w:val="0"/>
+                <w:sz w:val="16"/>
+              </w:rPr>
+              <w:t>Filing cabinet with two folders; one opening automatically; character observing</w:t>
+            </w:r>
+          </w:p>
+        </w:tc>
+        <w:tc>
+          <w:tcPr>
+            <w:tcW w:type="dxa" w:w="1800"/>
+          </w:tcPr>
+          <w:p>
+            <w:pPr>
+              <w:jc w:val="left"/>
+            </w:pPr>
+            <w:r>
+              <w:rPr>
+                <w:b w:val="0"/>
+                <w:sz w:val="16"/>
+              </w:rPr>
+              <w:t>Static. Cabinet holds; automatic filing paused by the question. 2s.</w:t>
+            </w:r>
+          </w:p>
+        </w:tc>
+      </w:tr>
+      <w:tr>
+        <w:tc>
+          <w:tcPr>
+            <w:tcW w:type="dxa" w:w="504"/>
+          </w:tcPr>
+          <w:p>
+            <w:pPr>
+              <w:jc w:val="left"/>
+            </w:pPr>
+            <w:r>
+              <w:rPr>
+                <w:b/>
+                <w:color w:val="999999"/>
+                <w:sz w:val="18"/>
+              </w:rPr>
+              <w:t>117</w:t>
+            </w:r>
+          </w:p>
+        </w:tc>
+        <w:tc>
+          <w:tcPr>
+            <w:tcW w:type="dxa" w:w="2448"/>
+          </w:tcPr>
+          <w:p>
+            <w:pPr>
+              <w:jc w:val="left"/>
+            </w:pPr>
+            <w:r>
+              <w:rPr>
+                <w:b/>
+                <w:sz w:val="18"/>
+              </w:rPr>
+              <w:t>And is that the account I would choose if I were choosing deliberately?</w:t>
+            </w:r>
+          </w:p>
+        </w:tc>
+        <w:tc>
+          <w:tcPr>
+            <w:tcW w:type="dxa" w:w="3600"/>
+          </w:tcPr>
+          <w:p>
+            <w:pPr>
+              <w:jc w:val="left"/>
+            </w:pPr>
+            <w:r>
+              <w:rPr>
+                <w:b w:val="0"/>
+                <w:sz w:val="16"/>
+              </w:rPr>
+              <w:t>Close-up. The same filing cabinet — but now a second, deliberate hand appears beside the automatic one. The deliberate hand points to a different folder. The two hands are visible together: automatic vs chosen. The choice belongs to the character.</w:t>
+            </w:r>
+          </w:p>
+        </w:tc>
+        <w:tc>
+          <w:tcPr>
+            <w:tcW w:type="dxa" w:w="1296"/>
+          </w:tcPr>
+          <w:p>
+            <w:pPr>
+              <w:jc w:val="left"/>
+            </w:pPr>
+            <w:r>
+              <w:rPr>
+                <w:b w:val="0"/>
+                <w:sz w:val="16"/>
+              </w:rPr>
+              <w:t>Close-up</w:t>
+            </w:r>
+          </w:p>
+        </w:tc>
+        <w:tc>
+          <w:tcPr>
+            <w:tcW w:type="dxa" w:w="1152"/>
+          </w:tcPr>
+          <w:p>
+            <w:pPr>
+              <w:jc w:val="left"/>
+            </w:pPr>
+            <w:r>
+              <w:rPr>
+                <w:b w:val="0"/>
+                <w:sz w:val="16"/>
+              </w:rPr>
+              <w:t>Flat, white</w:t>
+            </w:r>
+          </w:p>
+        </w:tc>
+        <w:tc>
+          <w:tcPr>
+            <w:tcW w:type="dxa" w:w="1440"/>
+          </w:tcPr>
+          <w:p>
+            <w:pPr>
+              <w:jc w:val="left"/>
+            </w:pPr>
+            <w:r>
+              <w:rPr>
+                <w:b w:val="0"/>
+                <w:sz w:val="16"/>
+              </w:rPr>
+              <w:t>The second question — autonomy reclaimed</w:t>
+            </w:r>
+          </w:p>
+        </w:tc>
+        <w:tc>
+          <w:tcPr>
+            <w:tcW w:type="dxa" w:w="1440"/>
+          </w:tcPr>
+          <w:p>
+            <w:pPr>
+              <w:jc w:val="left"/>
+            </w:pPr>
+            <w:r>
+              <w:rPr>
+                <w:b w:val="0"/>
+                <w:sz w:val="16"/>
+              </w:rPr>
+              <w:t>Automatic hand vs deliberate hand at filing cabinet; two choices visible</w:t>
+            </w:r>
+          </w:p>
+        </w:tc>
+        <w:tc>
+          <w:tcPr>
+            <w:tcW w:type="dxa" w:w="1800"/>
+          </w:tcPr>
+          <w:p>
+            <w:pPr>
+              <w:jc w:val="left"/>
+            </w:pPr>
+            <w:r>
+              <w:rPr>
+                <w:b w:val="0"/>
+                <w:sz w:val="16"/>
+              </w:rPr>
+              <w:t>Static. Both hands visible; deliberate hand points to considered choice. 3s.</w:t>
+            </w:r>
+          </w:p>
+        </w:tc>
+      </w:tr>
+      <w:tr>
+        <w:tc>
+          <w:tcPr>
+            <w:tcW w:type="dxa" w:w="8640"/>
+            <w:gridSpan w:val="8"/>
+            <w:shd w:val="clear" w:color="auto" w:fill="B02A2A"/>
+          </w:tcPr>
+          <w:p>
+            <w:pPr>
+              <w:jc w:val="center"/>
+            </w:pPr>
+            <w:r>
+              <w:rPr>
+                <w:b/>
+                <w:color w:val="FFFFFF"/>
+                <w:sz w:val="18"/>
+              </w:rPr>
+              <w:t>── THE ENDING ──</w:t>
+            </w:r>
+          </w:p>
+        </w:tc>
+      </w:tr>
+      <w:tr>
+        <w:tc>
+          <w:tcPr>
+            <w:tcW w:type="dxa" w:w="504"/>
+          </w:tcPr>
+          <w:p>
+            <w:pPr>
+              <w:jc w:val="left"/>
+            </w:pPr>
+            <w:r>
+              <w:rPr>
+                <w:b/>
+                <w:color w:val="999999"/>
+                <w:sz w:val="18"/>
+              </w:rPr>
+              <w:t>118</w:t>
+            </w:r>
+          </w:p>
+        </w:tc>
+        <w:tc>
+          <w:tcPr>
+            <w:tcW w:type="dxa" w:w="2448"/>
+          </w:tcPr>
+          <w:p>
+            <w:pPr>
+              <w:jc w:val="left"/>
+            </w:pPr>
+            <w:r>
+              <w:rPr>
+                <w:b/>
+                <w:sz w:val="18"/>
+              </w:rPr>
+              <w:t>The bonus, the win, the gift, the refund — your brain has already filed them somewhere.</w:t>
+            </w:r>
+          </w:p>
+        </w:tc>
+        <w:tc>
+          <w:tcPr>
+            <w:tcW w:type="dxa" w:w="3600"/>
+          </w:tcPr>
+          <w:p>
+            <w:pPr>
+              <w:jc w:val="left"/>
+            </w:pPr>
+            <w:r>
+              <w:rPr>
+                <w:b w:val="0"/>
+                <w:sz w:val="16"/>
+              </w:rPr>
+              <w:t>Wide shot. Four money types arrive and are instantly auto-filed by the brain — bonus to WINDFALL, win to WINDFALL, gift to WINDFALL, refund to WINDFALL. All four go to the same folder automatically, instantly, before any conscious thought.</w:t>
+            </w:r>
+          </w:p>
+        </w:tc>
+        <w:tc>
+          <w:tcPr>
+            <w:tcW w:type="dxa" w:w="1296"/>
+          </w:tcPr>
+          <w:p>
+            <w:pPr>
+              <w:jc w:val="left"/>
+            </w:pPr>
+            <w:r>
+              <w:rPr>
+                <w:b w:val="0"/>
+                <w:sz w:val="16"/>
+              </w:rPr>
+              <w:t>Wide shot</w:t>
+            </w:r>
+          </w:p>
+        </w:tc>
+        <w:tc>
+          <w:tcPr>
+            <w:tcW w:type="dxa" w:w="1152"/>
+          </w:tcPr>
+          <w:p>
+            <w:pPr>
+              <w:jc w:val="left"/>
+            </w:pPr>
+            <w:r>
+              <w:rPr>
+                <w:b w:val="0"/>
+                <w:sz w:val="16"/>
+              </w:rPr>
+              <w:t>Flat, white</w:t>
+            </w:r>
+          </w:p>
+        </w:tc>
+        <w:tc>
+          <w:tcPr>
+            <w:tcW w:type="dxa" w:w="1440"/>
+          </w:tcPr>
+          <w:p>
+            <w:pPr>
+              <w:jc w:val="left"/>
+            </w:pPr>
+            <w:r>
+              <w:rPr>
+                <w:b w:val="0"/>
+                <w:sz w:val="16"/>
+              </w:rPr>
+              <w:t>The automatic system — the default is already running</w:t>
+            </w:r>
+          </w:p>
+        </w:tc>
+        <w:tc>
+          <w:tcPr>
+            <w:tcW w:type="dxa" w:w="1440"/>
+          </w:tcPr>
+          <w:p>
+            <w:pPr>
+              <w:jc w:val="left"/>
+            </w:pPr>
+            <w:r>
+              <w:rPr>
+                <w:b w:val="0"/>
+                <w:sz w:val="16"/>
+              </w:rPr>
+              <w:t>Four money types auto-filed to WINDFALL instantly; no conscious input</w:t>
+            </w:r>
+          </w:p>
+        </w:tc>
+        <w:tc>
+          <w:tcPr>
+            <w:tcW w:type="dxa" w:w="1800"/>
+          </w:tcPr>
+          <w:p>
+            <w:pPr>
+              <w:jc w:val="left"/>
+            </w:pPr>
+            <w:r>
+              <w:rPr>
+                <w:b w:val="0"/>
+                <w:sz w:val="16"/>
+              </w:rPr>
+              <w:t>Static. All four file to WINDFALL simultaneously; speed is the point. 2s.</w:t>
+            </w:r>
+          </w:p>
+        </w:tc>
+      </w:tr>
+      <w:tr>
+        <w:tc>
+          <w:tcPr>
+            <w:tcW w:type="dxa" w:w="504"/>
+          </w:tcPr>
+          <w:p>
+            <w:pPr>
+              <w:jc w:val="left"/>
+            </w:pPr>
+            <w:r>
+              <w:rPr>
+                <w:b/>
+                <w:color w:val="999999"/>
+                <w:sz w:val="18"/>
+              </w:rPr>
+              <w:t>119</w:t>
+            </w:r>
+          </w:p>
+        </w:tc>
+        <w:tc>
+          <w:tcPr>
+            <w:tcW w:type="dxa" w:w="2448"/>
+          </w:tcPr>
+          <w:p>
+            <w:pPr>
+              <w:jc w:val="left"/>
+            </w:pPr>
+            <w:r>
+              <w:rPr>
+                <w:b/>
+                <w:sz w:val="18"/>
+              </w:rPr>
+              <w:t>The only question is whether you agree with the filing.</w:t>
+            </w:r>
+          </w:p>
+        </w:tc>
+        <w:tc>
+          <w:tcPr>
+            <w:tcW w:type="dxa" w:w="3600"/>
+          </w:tcPr>
+          <w:p>
+            <w:pPr>
+              <w:jc w:val="left"/>
+            </w:pPr>
+            <w:r>
+              <w:rPr>
+                <w:b w:val="0"/>
+                <w:sz w:val="16"/>
+              </w:rPr>
+              <w:t>Wide shot. The same four money types — but now the character stands at the cabinet, reviewing each filing with a pen. Some stay in WINDFALL. Some get moved to EARNED. The character makes deliberate choices, one by one. Expression: calm and capable.</w:t>
+            </w:r>
+          </w:p>
+        </w:tc>
+        <w:tc>
+          <w:tcPr>
+            <w:tcW w:type="dxa" w:w="1296"/>
+          </w:tcPr>
+          <w:p>
+            <w:pPr>
+              <w:jc w:val="left"/>
+            </w:pPr>
+            <w:r>
+              <w:rPr>
+                <w:b w:val="0"/>
+                <w:sz w:val="16"/>
+              </w:rPr>
+              <w:t>Wide shot</w:t>
+            </w:r>
+          </w:p>
+        </w:tc>
+        <w:tc>
+          <w:tcPr>
+            <w:tcW w:type="dxa" w:w="1152"/>
+          </w:tcPr>
+          <w:p>
+            <w:pPr>
+              <w:jc w:val="left"/>
+            </w:pPr>
+            <w:r>
+              <w:rPr>
+                <w:b w:val="0"/>
+                <w:sz w:val="16"/>
+              </w:rPr>
+              <w:t>Flat, white</w:t>
+            </w:r>
+          </w:p>
+        </w:tc>
+        <w:tc>
+          <w:tcPr>
+            <w:tcW w:type="dxa" w:w="1440"/>
+          </w:tcPr>
+          <w:p>
+            <w:pPr>
+              <w:jc w:val="left"/>
+            </w:pPr>
+            <w:r>
+              <w:rPr>
+                <w:b w:val="0"/>
+                <w:sz w:val="16"/>
+              </w:rPr>
+              <w:t>The agency — the audit is possible and practical</w:t>
+            </w:r>
+          </w:p>
+        </w:tc>
+        <w:tc>
+          <w:tcPr>
+            <w:tcW w:type="dxa" w:w="1440"/>
+          </w:tcPr>
+          <w:p>
+            <w:pPr>
+              <w:jc w:val="left"/>
+            </w:pPr>
+            <w:r>
+              <w:rPr>
+                <w:b w:val="0"/>
+                <w:sz w:val="16"/>
+              </w:rPr>
+              <w:t>Character reviewing and adjusting auto-filings deliberately; pen in hand</w:t>
+            </w:r>
+          </w:p>
+        </w:tc>
+        <w:tc>
+          <w:tcPr>
+            <w:tcW w:type="dxa" w:w="1800"/>
+          </w:tcPr>
+          <w:p>
+            <w:pPr>
+              <w:jc w:val="left"/>
+            </w:pPr>
+            <w:r>
+              <w:rPr>
+                <w:b w:val="0"/>
+                <w:sz w:val="16"/>
+              </w:rPr>
+              <w:t>Static. Character moves items with deliberate intention; expression is composed. 3s.</w:t>
+            </w:r>
+          </w:p>
+        </w:tc>
+      </w:tr>
+      <w:tr>
+        <w:tc>
+          <w:tcPr>
+            <w:tcW w:type="dxa" w:w="504"/>
+          </w:tcPr>
+          <w:p>
+            <w:pPr>
+              <w:jc w:val="left"/>
+            </w:pPr>
+            <w:r>
+              <w:rPr>
+                <w:b/>
+                <w:color w:val="999999"/>
+                <w:sz w:val="18"/>
+              </w:rPr>
+              <w:t>120</w:t>
+            </w:r>
+          </w:p>
+        </w:tc>
+        <w:tc>
+          <w:tcPr>
+            <w:tcW w:type="dxa" w:w="2448"/>
+          </w:tcPr>
+          <w:p>
+            <w:pPr>
+              <w:jc w:val="left"/>
+            </w:pPr>
+            <w:r>
+              <w:rPr>
+                <w:b/>
+                <w:sz w:val="18"/>
+              </w:rPr>
+              <w:t>Every video on this channel is one way your financial gut has been hacked.</w:t>
+            </w:r>
+          </w:p>
+        </w:tc>
+        <w:tc>
+          <w:tcPr>
+            <w:tcW w:type="dxa" w:w="3600"/>
+          </w:tcPr>
+          <w:p>
+            <w:pPr>
+              <w:jc w:val="left"/>
+            </w:pPr>
+            <w:r>
+              <w:rPr>
+                <w:b w:val="0"/>
+                <w:sz w:val="16"/>
+              </w:rPr>
+              <w:t>Wide shot, white background. The main character faces camera — the brain inside the skull now with its composed, watchful expression (not smug). A row of small icons stretches behind the character: dopamine, bandwidth, somatic markers, mental accounts — each labeled. The channel's mission is visible.</w:t>
+            </w:r>
+          </w:p>
+        </w:tc>
+        <w:tc>
+          <w:tcPr>
+            <w:tcW w:type="dxa" w:w="1296"/>
+          </w:tcPr>
+          <w:p>
+            <w:pPr>
+              <w:jc w:val="left"/>
+            </w:pPr>
+            <w:r>
+              <w:rPr>
+                <w:b w:val="0"/>
+                <w:sz w:val="16"/>
+              </w:rPr>
+              <w:t>Wide shot, direct address</w:t>
+            </w:r>
+          </w:p>
+        </w:tc>
+        <w:tc>
+          <w:tcPr>
+            <w:tcW w:type="dxa" w:w="1152"/>
+          </w:tcPr>
+          <w:p>
+            <w:pPr>
+              <w:jc w:val="left"/>
+            </w:pPr>
+            <w:r>
+              <w:rPr>
+                <w:b w:val="0"/>
+                <w:sz w:val="16"/>
+              </w:rPr>
+              <w:t>Flat, white</w:t>
+            </w:r>
+          </w:p>
+        </w:tc>
+        <w:tc>
+          <w:tcPr>
+            <w:tcW w:type="dxa" w:w="1440"/>
+          </w:tcPr>
+          <w:p>
+            <w:pPr>
+              <w:jc w:val="left"/>
+            </w:pPr>
+            <w:r>
+              <w:rPr>
+                <w:b w:val="0"/>
+                <w:sz w:val="16"/>
+              </w:rPr>
+              <w:t>Channel mission — the promise to the viewer</w:t>
+            </w:r>
+          </w:p>
+        </w:tc>
+        <w:tc>
+          <w:tcPr>
+            <w:tcW w:type="dxa" w:w="1440"/>
+          </w:tcPr>
+          <w:p>
+            <w:pPr>
+              <w:jc w:val="left"/>
+            </w:pPr>
+            <w:r>
+              <w:rPr>
+                <w:b w:val="0"/>
+                <w:sz w:val="16"/>
+              </w:rPr>
+              <w:t>Character facing camera; row of channel topic icons behind; brain watchful</w:t>
+            </w:r>
+          </w:p>
+        </w:tc>
+        <w:tc>
+          <w:tcPr>
+            <w:tcW w:type="dxa" w:w="1800"/>
+          </w:tcPr>
+          <w:p>
+            <w:pPr>
+              <w:jc w:val="left"/>
+            </w:pPr>
+            <w:r>
+              <w:rPr>
+                <w:b w:val="0"/>
+                <w:sz w:val="16"/>
+              </w:rPr>
+              <w:t>Static. Topic icons glow softly; character holds direct address. 3s.</w:t>
+            </w:r>
+          </w:p>
+        </w:tc>
+      </w:tr>
+      <w:tr>
+        <w:tc>
+          <w:tcPr>
+            <w:tcW w:type="dxa" w:w="504"/>
+          </w:tcPr>
+          <w:p>
+            <w:pPr>
+              <w:jc w:val="left"/>
+            </w:pPr>
+            <w:r>
+              <w:rPr>
+                <w:b/>
+                <w:color w:val="999999"/>
+                <w:sz w:val="18"/>
+              </w:rPr>
+              <w:t>121</w:t>
             </w:r>
           </w:p>
         </w:tc>
@@ -16428,7 +17284,7 @@
           <w:color w:val="666666"/>
           <w:sz w:val="18"/>
         </w:rPr>
-        <w:t>TOTAL: 115 beats · ~1479 words · ~11 min narration</w:t>
+        <w:t>TOTAL: 121 beats · ~1649 words · ~12 min narration</w:t>
       </w:r>
     </w:p>
     <w:sectPr>

</xml_diff>